<commit_message>
fix(resume): regenerate the tracked DOCX beside the PDF
</commit_message>
<xml_diff>
--- a/Alberto_Nieto_Resume.docx
+++ b/Alberto_Nieto_Resume.docx
@@ -53,7 +53,7 @@
           <w:color w:val="333333"/>
           <w:sz w:val="21"/>
         </w:rPr>
-        <w:t>Strategic and hands-on technology leader with 25+ years in financial services, specializing in AI-driven automation, cloud-native solutions, and enterprise-scale data engineering. Career spans from banking operations to Principal Engineer — building deep domain expertise at every level. Expert in Agentic AI frameworks, GCP infrastructure, and scalable automation pipelines. Open source contributor with published Python libraries on PyPI. Co-inventor on patent application. Bilingual in English and Spanish.</w:t>
+        <w:t>Strategic and hands-on technology leader with 26 years at Wells Fargo in financial services technology, specializing in AI-driven automation, cloud-native solutions, and enterprise-scale data engineering. Career spans from banking operations to Principal Engineer — building deep domain expertise at every level. Expert in Agentic AI frameworks, GCP infrastructure, and scalable automation pipelines. Open source contributor with eight Python libraries on PyPI. Co-inventor on two pending patent applications. Bilingual in English and Spanish.</w:t>
       </w:r>
     </w:p>
     <w:p>
@@ -146,7 +146,7 @@
           <w:color w:val="333333"/>
           <w:sz w:val="21"/>
         </w:rPr>
-        <w:t>CLI tool for Python docstring quality vetting. 19 rules across completeness, accuracy, rendering, and visibility.</w:t>
+        <w:t>CLI tool for Python docstring quality vetting. 31 rules across presence, completeness, accuracy, rendering, and visibility.</w:t>
       </w:r>
     </w:p>
     <w:p>
@@ -169,6 +169,116 @@
           <w:sz w:val="21"/>
         </w:rPr>
         <w:t>Evolutionary prompt optimization for AI agents using Google ADK. Automatically evolves agent instructions through iterative improvement.</w:t>
+      </w:r>
+    </w:p>
+    <w:p>
+      <w:pPr>
+        <w:ind w:left="360"/>
+      </w:pPr>
+      <w:r>
+        <w:rPr>
+          <w:rFonts w:ascii="Calibri" w:hAnsi="Calibri"/>
+          <w:b/>
+          <w:color w:val="1B3A5C"/>
+          <w:sz w:val="21"/>
+        </w:rPr>
+        <w:t xml:space="preserve">vramfit: </w:t>
+      </w:r>
+      <w:r>
+        <w:rPr>
+          <w:rFonts w:ascii="Calibri" w:hAnsi="Calibri"/>
+          <w:color w:val="333333"/>
+          <w:sz w:val="21"/>
+        </w:rPr>
+        <w:t>Fits large open models onto one GPU by measuring per-layer quantization damage and solving a mixed-precision recipe against a VRAM budget. Three published model packs on Hugging Face.</w:t>
+      </w:r>
+    </w:p>
+    <w:p>
+      <w:pPr>
+        <w:ind w:left="360"/>
+      </w:pPr>
+      <w:r>
+        <w:rPr>
+          <w:rFonts w:ascii="Calibri" w:hAnsi="Calibri"/>
+          <w:b/>
+          <w:color w:val="1B3A5C"/>
+          <w:sz w:val="21"/>
+        </w:rPr>
+        <w:t xml:space="preserve">typevet: </w:t>
+      </w:r>
+      <w:r>
+        <w:rPr>
+          <w:rFonts w:ascii="Calibri" w:hAnsi="Calibri"/>
+          <w:color w:val="333333"/>
+          <w:sz w:val="21"/>
+        </w:rPr>
+        <w:t>Typed answers from open models about text and images: yes or no, one label, or a rubric level, read from next-token probabilities. Gemma 4 31B on llama.cpp and vLLM.</w:t>
+      </w:r>
+    </w:p>
+    <w:p>
+      <w:pPr>
+        <w:ind w:left="360"/>
+      </w:pPr>
+      <w:r>
+        <w:rPr>
+          <w:rFonts w:ascii="Calibri" w:hAnsi="Calibri"/>
+          <w:b/>
+          <w:color w:val="1B3A5C"/>
+          <w:sz w:val="21"/>
+        </w:rPr>
+        <w:t xml:space="preserve">judgevet: </w:t>
+      </w:r>
+      <w:r>
+        <w:rPr>
+          <w:rFonts w:ascii="Calibri" w:hAnsi="Calibri"/>
+          <w:color w:val="333333"/>
+          <w:sz w:val="21"/>
+        </w:rPr>
+        <w:t>Typed Python client, CLI, and MCP server for TypeSafe's Jev judgment model.</w:t>
+      </w:r>
+    </w:p>
+    <w:p>
+      <w:pPr>
+        <w:ind w:left="360"/>
+      </w:pPr>
+      <w:r>
+        <w:rPr>
+          <w:rFonts w:ascii="Calibri" w:hAnsi="Calibri"/>
+          <w:b/>
+          <w:color w:val="1B3A5C"/>
+          <w:sz w:val="21"/>
+        </w:rPr>
+        <w:t xml:space="preserve">saucier: </w:t>
+      </w:r>
+      <w:r>
+        <w:rPr>
+          <w:rFonts w:ascii="Calibri" w:hAnsi="Calibri"/>
+          <w:color w:val="333333"/>
+          <w:sz w:val="21"/>
+        </w:rPr>
+        <w:t>Provenance-traced extraction from a 1909 cookbook: 151 sauces, every claim traced to the line it came from.</w:t>
+      </w:r>
+    </w:p>
+    <w:p>
+      <w:pPr>
+        <w:ind w:left="360"/>
+      </w:pPr>
+      <w:r>
+        <w:rPr>
+          <w:rFonts w:ascii="Calibri" w:hAnsi="Calibri"/>
+          <w:b/>
+          <w:color w:val="1B3A5C"/>
+          <w:sz w:val="21"/>
+        </w:rPr>
+        <w:t xml:space="preserve">turboquant-vllm: </w:t>
+      </w:r>
+      <w:r>
+        <w:rPr>
+          <w:rFonts w:ascii="Calibri" w:hAnsi="Calibri"/>
+          <w:color w:val="333333"/>
+          <w:sz w:val="21"/>
+        </w:rPr>
+        <w:t>KV cache compression plugin for vLLM.</w:t>
       </w:r>
     </w:p>
     <w:p>
@@ -199,7 +309,7 @@
           <w:color w:val="333333"/>
           <w:sz w:val="21"/>
         </w:rPr>
-        <w:t>January 2026 — Named as co-inventor on patent application</w:t>
+        <w:t>Co-inventor on two pending patent applications (first named January 2026)</w:t>
       </w:r>
     </w:p>
     <w:p>

</xml_diff>

<commit_message>
fix(resume): count Wells Fargo years from the start date and list all eight packages (#65)
</commit_message>
<xml_diff>
--- a/Alberto_Nieto_Resume.docx
+++ b/Alberto_Nieto_Resume.docx
@@ -53,7 +53,7 @@
           <w:color w:val="333333"/>
           <w:sz w:val="21"/>
         </w:rPr>
-        <w:t>Strategic and hands-on technology leader with 25+ years in financial services, specializing in AI-driven automation, cloud-native solutions, and enterprise-scale data engineering. Career spans from banking operations to Principal Engineer — building deep domain expertise at every level. Expert in Agentic AI frameworks, GCP infrastructure, and scalable automation pipelines. Open source contributor with published Python libraries on PyPI. Co-inventor on patent application. Bilingual in English and Spanish.</w:t>
+        <w:t>Strategic and hands-on technology leader with 26 years at Wells Fargo in financial services technology, specializing in AI-driven automation, cloud-native solutions, and enterprise-scale data engineering. Career spans from banking operations to Principal Engineer — building deep domain expertise at every level. Expert in Agentic AI frameworks, GCP infrastructure, and scalable automation pipelines. Open source contributor with eight Python libraries on PyPI. Co-inventor on two pending patent applications. Bilingual in English and Spanish.</w:t>
       </w:r>
     </w:p>
     <w:p>
@@ -146,7 +146,7 @@
           <w:color w:val="333333"/>
           <w:sz w:val="21"/>
         </w:rPr>
-        <w:t>CLI tool for Python docstring quality vetting. 19 rules across completeness, accuracy, rendering, and visibility.</w:t>
+        <w:t>CLI tool for Python docstring quality vetting. 31 rules across presence, completeness, accuracy, rendering, and visibility.</w:t>
       </w:r>
     </w:p>
     <w:p>
@@ -169,6 +169,116 @@
           <w:sz w:val="21"/>
         </w:rPr>
         <w:t>Evolutionary prompt optimization for AI agents using Google ADK. Automatically evolves agent instructions through iterative improvement.</w:t>
+      </w:r>
+    </w:p>
+    <w:p>
+      <w:pPr>
+        <w:ind w:left="360"/>
+      </w:pPr>
+      <w:r>
+        <w:rPr>
+          <w:rFonts w:ascii="Calibri" w:hAnsi="Calibri"/>
+          <w:b/>
+          <w:color w:val="1B3A5C"/>
+          <w:sz w:val="21"/>
+        </w:rPr>
+        <w:t xml:space="preserve">vramfit: </w:t>
+      </w:r>
+      <w:r>
+        <w:rPr>
+          <w:rFonts w:ascii="Calibri" w:hAnsi="Calibri"/>
+          <w:color w:val="333333"/>
+          <w:sz w:val="21"/>
+        </w:rPr>
+        <w:t>Fits large open models onto one GPU by measuring per-layer quantization damage and solving a mixed-precision recipe against a VRAM budget. Three published model packs on Hugging Face.</w:t>
+      </w:r>
+    </w:p>
+    <w:p>
+      <w:pPr>
+        <w:ind w:left="360"/>
+      </w:pPr>
+      <w:r>
+        <w:rPr>
+          <w:rFonts w:ascii="Calibri" w:hAnsi="Calibri"/>
+          <w:b/>
+          <w:color w:val="1B3A5C"/>
+          <w:sz w:val="21"/>
+        </w:rPr>
+        <w:t xml:space="preserve">typevet: </w:t>
+      </w:r>
+      <w:r>
+        <w:rPr>
+          <w:rFonts w:ascii="Calibri" w:hAnsi="Calibri"/>
+          <w:color w:val="333333"/>
+          <w:sz w:val="21"/>
+        </w:rPr>
+        <w:t>Typed answers from open models about text and images: yes or no, one label, or a rubric level, read from next-token probabilities. Gemma 4 31B on llama.cpp and vLLM.</w:t>
+      </w:r>
+    </w:p>
+    <w:p>
+      <w:pPr>
+        <w:ind w:left="360"/>
+      </w:pPr>
+      <w:r>
+        <w:rPr>
+          <w:rFonts w:ascii="Calibri" w:hAnsi="Calibri"/>
+          <w:b/>
+          <w:color w:val="1B3A5C"/>
+          <w:sz w:val="21"/>
+        </w:rPr>
+        <w:t xml:space="preserve">judgevet: </w:t>
+      </w:r>
+      <w:r>
+        <w:rPr>
+          <w:rFonts w:ascii="Calibri" w:hAnsi="Calibri"/>
+          <w:color w:val="333333"/>
+          <w:sz w:val="21"/>
+        </w:rPr>
+        <w:t>Typed Python client, CLI, and MCP server for TypeSafe's Jev judgment model.</w:t>
+      </w:r>
+    </w:p>
+    <w:p>
+      <w:pPr>
+        <w:ind w:left="360"/>
+      </w:pPr>
+      <w:r>
+        <w:rPr>
+          <w:rFonts w:ascii="Calibri" w:hAnsi="Calibri"/>
+          <w:b/>
+          <w:color w:val="1B3A5C"/>
+          <w:sz w:val="21"/>
+        </w:rPr>
+        <w:t xml:space="preserve">saucier: </w:t>
+      </w:r>
+      <w:r>
+        <w:rPr>
+          <w:rFonts w:ascii="Calibri" w:hAnsi="Calibri"/>
+          <w:color w:val="333333"/>
+          <w:sz w:val="21"/>
+        </w:rPr>
+        <w:t>Provenance-traced extraction from a 1909 cookbook: 151 sauces, every claim traced to the line it came from.</w:t>
+      </w:r>
+    </w:p>
+    <w:p>
+      <w:pPr>
+        <w:ind w:left="360"/>
+      </w:pPr>
+      <w:r>
+        <w:rPr>
+          <w:rFonts w:ascii="Calibri" w:hAnsi="Calibri"/>
+          <w:b/>
+          <w:color w:val="1B3A5C"/>
+          <w:sz w:val="21"/>
+        </w:rPr>
+        <w:t xml:space="preserve">turboquant-vllm: </w:t>
+      </w:r>
+      <w:r>
+        <w:rPr>
+          <w:rFonts w:ascii="Calibri" w:hAnsi="Calibri"/>
+          <w:color w:val="333333"/>
+          <w:sz w:val="21"/>
+        </w:rPr>
+        <w:t>KV cache compression plugin for vLLM.</w:t>
       </w:r>
     </w:p>
     <w:p>
@@ -199,7 +309,7 @@
           <w:color w:val="333333"/>
           <w:sz w:val="21"/>
         </w:rPr>
-        <w:t>January 2026 — Named as co-inventor on patent application</w:t>
+        <w:t>Co-inventor on two pending patent applications (first named January 2026)</w:t>
       </w:r>
     </w:p>
     <w:p>

</xml_diff>

<commit_message>
fix(resume): current role starts Jul 2025, in Chandler
Workday puts time in position at 1 year 2 months 29 days on 2026-10-01, so
the current role began in July 2025, as the Experience page already said.
The resume moves from Jun to Jul 2025 for that start and the prior role's
end. The three roles from 2018 on read Chandler, Arizona (Phoenix area) on
both the resume and the Experience page. Closes #85.
</commit_message>
<xml_diff>
--- a/Alberto_Nieto_Resume.docx
+++ b/Alberto_Nieto_Resume.docx
@@ -382,7 +382,7 @@
           <w:color w:val="555555"/>
           <w:sz w:val="19"/>
         </w:rPr>
-        <w:t>Jun 2025 – Present</w:t>
+        <w:t>Jul 2025 – Present</w:t>
       </w:r>
     </w:p>
     <w:p>
@@ -395,7 +395,7 @@
           <w:color w:val="555555"/>
           <w:sz w:val="19"/>
         </w:rPr>
-        <w:t>Wells Fargo, Phoenix, Arizona</w:t>
+        <w:t>Wells Fargo, Chandler, Arizona (Phoenix area)</w:t>
       </w:r>
     </w:p>
     <w:p>
@@ -506,7 +506,7 @@
           <w:color w:val="555555"/>
           <w:sz w:val="19"/>
         </w:rPr>
-        <w:t>Jun 2022 – Jun 2025</w:t>
+        <w:t>Jun 2022 – Jul 2025</w:t>
       </w:r>
     </w:p>
     <w:p>
@@ -519,7 +519,7 @@
           <w:color w:val="555555"/>
           <w:sz w:val="19"/>
         </w:rPr>
-        <w:t>Wells Fargo, Phoenix, Arizona</w:t>
+        <w:t>Wells Fargo, Chandler, Arizona (Phoenix area)</w:t>
       </w:r>
     </w:p>
     <w:p>
@@ -643,7 +643,7 @@
           <w:color w:val="555555"/>
           <w:sz w:val="19"/>
         </w:rPr>
-        <w:t>Wells Fargo, Phoenix, Arizona</w:t>
+        <w:t>Wells Fargo, Chandler, Arizona (Phoenix area)</w:t>
       </w:r>
     </w:p>
     <w:p>

</xml_diff>

<commit_message>
fix(resume): current role starts Jul 2025, in Chandler (#89)
</commit_message>
<xml_diff>
--- a/Alberto_Nieto_Resume.docx
+++ b/Alberto_Nieto_Resume.docx
@@ -382,7 +382,7 @@
           <w:color w:val="555555"/>
           <w:sz w:val="19"/>
         </w:rPr>
-        <w:t>Jun 2025 – Present</w:t>
+        <w:t>Jul 2025 – Present</w:t>
       </w:r>
     </w:p>
     <w:p>
@@ -395,7 +395,7 @@
           <w:color w:val="555555"/>
           <w:sz w:val="19"/>
         </w:rPr>
-        <w:t>Wells Fargo, Phoenix, Arizona</w:t>
+        <w:t>Wells Fargo, Chandler, Arizona (Phoenix area)</w:t>
       </w:r>
     </w:p>
     <w:p>
@@ -506,7 +506,7 @@
           <w:color w:val="555555"/>
           <w:sz w:val="19"/>
         </w:rPr>
-        <w:t>Jun 2022 – Jun 2025</w:t>
+        <w:t>Jun 2022 – Jul 2025</w:t>
       </w:r>
     </w:p>
     <w:p>
@@ -519,7 +519,7 @@
           <w:color w:val="555555"/>
           <w:sz w:val="19"/>
         </w:rPr>
-        <w:t>Wells Fargo, Phoenix, Arizona</w:t>
+        <w:t>Wells Fargo, Chandler, Arizona (Phoenix area)</w:t>
       </w:r>
     </w:p>
     <w:p>
@@ -643,7 +643,7 @@
           <w:color w:val="555555"/>
           <w:sz w:val="19"/>
         </w:rPr>
-        <w:t>Wells Fargo, Phoenix, Arizona</w:t>
+        <w:t>Wells Fargo, Chandler, Arizona (Phoenix area)</w:t>
       </w:r>
     </w:p>
     <w:p>

</xml_diff>